<commit_message>
Cap nhat BR-1 lam tron + xuat PDF/Excel + theme web.zip
- BR-1: lam tron khoi luong 3 so le truoc khi nhan don gia (S1 = 4.296.000)
- BR-1b: tong bao gia lam tron xuong boi so 100.000
- Them xuat PDF (window.print A4 landscape) va Excel (exceljs)
- Restyle UI theo owin-theme.css; bo sung field ngay/thang/nam, lam_tron, can_thanh_toan vao template + placeholders
- Test 45/45 pass
</commit_message>
<xml_diff>
--- a/owin-quote-tool/src/assets/templates/Template_Bang_Gia.docx
+++ b/owin-quote-tool/src/assets/templates/Template_Bang_Gia.docx
@@ -27,6 +27,17 @@
     <w:p>
       <w:r>
         <w:t>SĐT: {sdt}    Email: {email}</w:t>
+      </w:r>
+    </w:p>
+    <w:p>
+      <w:pPr>
+        <w:jc w:val="right"/>
+      </w:pPr>
+      <w:r>
+        <w:rPr>
+          <w:i/>
+        </w:rPr>
+        <w:t>Ngày {ngay} tháng {thang} năm {nam}</w:t>
       </w:r>
     </w:p>
     <w:p/>
@@ -338,6 +349,14 @@
         <w:jc w:val="right"/>
       </w:pPr>
       <w:r>
+        <w:t>Làm tròn: {lam_tron}</w:t>
+      </w:r>
+    </w:p>
+    <w:p>
+      <w:pPr>
+        <w:jc w:val="right"/>
+      </w:pPr>
+      <w:r>
         <w:t>Tạm ứng: {tam_ung}</w:t>
       </w:r>
     </w:p>
@@ -349,7 +368,7 @@
         <w:rPr>
           <w:b/>
         </w:rPr>
-        <w:t>Còn lại: {con_lai}</w:t>
+        <w:t>Cần thanh toán: {can_thanh_toan}</w:t>
       </w:r>
     </w:p>
     <w:sectPr>

</xml_diff>

<commit_message>
fix(reference-parity): complete product quote data and template migration
</commit_message>
<xml_diff>
--- a/owin-quote-tool/src/assets/templates/Template_Bang_Gia.docx
+++ b/owin-quote-tool/src/assets/templates/Template_Bang_Gia.docx
@@ -2,73 +2,224 @@
 <file path=word/document.xml><?xml version="1.0" encoding="utf-8"?>
 <w:document xmlns:wpc="http://schemas.microsoft.com/office/word/2010/wordprocessingCanvas" xmlns:mo="http://schemas.microsoft.com/office/mac/office/2008/main" xmlns:mc="http://schemas.openxmlformats.org/markup-compatibility/2006" xmlns:mv="urn:schemas-microsoft-com:mac:vml" xmlns:o="urn:schemas-microsoft-com:office:office" xmlns:r="http://schemas.openxmlformats.org/officeDocument/2006/relationships" xmlns:m="http://schemas.openxmlformats.org/officeDocument/2006/math" xmlns:v="urn:schemas-microsoft-com:vml" xmlns:wp14="http://schemas.microsoft.com/office/word/2010/wordprocessingDrawing" xmlns:wp="http://schemas.openxmlformats.org/drawingml/2006/wordprocessingDrawing" xmlns:w10="urn:schemas-microsoft-com:office:word" xmlns:w="http://schemas.openxmlformats.org/wordprocessingml/2006/main" xmlns:w14="http://schemas.microsoft.com/office/word/2010/wordml" xmlns:wpg="http://schemas.microsoft.com/office/word/2010/wordprocessingGroup" xmlns:wpi="http://schemas.microsoft.com/office/word/2010/wordprocessingInk" xmlns:wne="http://schemas.microsoft.com/office/word/2006/wordml" xmlns:wps="http://schemas.microsoft.com/office/word/2010/wordprocessingShape" mc:Ignorable="w14 wp14">
   <w:body>
-    <w:p>
-      <w:pPr>
-        <w:jc w:val="center"/>
-      </w:pPr>
-      <w:r>
-        <w:rPr>
-          <w:b/>
-          <w:sz w:val="32"/>
-        </w:rPr>
-        <w:t>BẢNG GIÁ HOÀN THIỆN NHÔM OWIN</w:t>
-      </w:r>
-    </w:p>
-    <w:p>
-      <w:r>
-        <w:t>Khách hàng: {ten_kh}</w:t>
-      </w:r>
-    </w:p>
-    <w:p>
-      <w:r>
-        <w:t>Địa chỉ: {dia_chi}</w:t>
-      </w:r>
-    </w:p>
-    <w:p>
-      <w:r>
-        <w:t>SĐT: {sdt}    Email: {email}</w:t>
-      </w:r>
-    </w:p>
-    <w:p>
-      <w:pPr>
-        <w:jc w:val="right"/>
-      </w:pPr>
-      <w:r>
-        <w:rPr>
-          <w:i/>
-        </w:rPr>
-        <w:t>Ngày {ngay} tháng {thang} năm {nam}</w:t>
-      </w:r>
-    </w:p>
-    <w:p/>
     <w:tbl>
       <w:tblPr>
-        <w:tblStyle w:val="TableGrid"/>
-        <w:tblW w:type="auto" w:w="0"/>
+        <w:tblW w:type="dxa" w:w="15989"/>
+        <w:jc w:val="center"/>
+        <w:tblLayout w:type="fixed"/>
         <w:tblLook w:firstColumn="1" w:firstRow="1" w:lastColumn="0" w:lastRow="0" w:noHBand="0" w:noVBand="1" w:val="04A0"/>
       </w:tblPr>
       <w:tblGrid>
-        <w:gridCol w:w="960"/>
-        <w:gridCol w:w="960"/>
-        <w:gridCol w:w="960"/>
-        <w:gridCol w:w="960"/>
-        <w:gridCol w:w="960"/>
-        <w:gridCol w:w="960"/>
-        <w:gridCol w:w="960"/>
-        <w:gridCol w:w="960"/>
-        <w:gridCol w:w="960"/>
+        <w:gridCol w:w="2948"/>
+        <w:gridCol w:w="13041"/>
       </w:tblGrid>
       <w:tr>
+        <w:trPr>
+          <w:trHeight w:val="1190" w:hRule="atLeast"/>
+        </w:trPr>
         <w:tc>
           <w:tcPr>
-            <w:tcW w:type="dxa" w:w="960"/>
+            <w:tcW w:type="dxa" w:w="2948"/>
+            <w:tcBorders>
+              <w:top w:val="single" w:sz="10" w:color="000000"/>
+              <w:left w:val="single" w:sz="10" w:color="000000"/>
+              <w:bottom w:val="single" w:sz="10" w:color="000000"/>
+              <w:right w:val="single" w:sz="10" w:color="000000"/>
+            </w:tcBorders>
+            <w:tcMar>
+              <w:top w:w="80" w:type="dxa"/>
+              <w:start w:w="80" w:type="dxa"/>
+              <w:bottom w:w="80" w:type="dxa"/>
+              <w:end w:w="80" w:type="dxa"/>
+            </w:tcMar>
+            <w:vAlign w:val="center"/>
           </w:tcPr>
           <w:p>
-            <w:r/>
+            <w:pPr>
+              <w:spacing w:before="0" w:after="0"/>
+              <w:jc w:val="center"/>
+            </w:pPr>
+            <w:r>
+              <w:drawing>
+                <wp:inline xmlns:a="http://schemas.openxmlformats.org/drawingml/2006/main" xmlns:pic="http://schemas.openxmlformats.org/drawingml/2006/picture">
+                  <wp:extent cx="774000" cy="576000"/>
+                  <wp:docPr id="1" name="Picture 1"/>
+                  <wp:cNvGraphicFramePr>
+                    <a:graphicFrameLocks noChangeAspect="1"/>
+                  </wp:cNvGraphicFramePr>
+                  <a:graphic>
+                    <a:graphicData uri="http://schemas.openxmlformats.org/drawingml/2006/picture">
+                      <pic:pic>
+                        <pic:nvPicPr>
+                          <pic:cNvPr id="0" name="owin_logo.jpg"/>
+                          <pic:cNvPicPr/>
+                        </pic:nvPicPr>
+                        <pic:blipFill>
+                          <a:blip r:embed="rId9"/>
+                          <a:stretch>
+                            <a:fillRect/>
+                          </a:stretch>
+                        </pic:blipFill>
+                        <pic:spPr>
+                          <a:xfrm>
+                            <a:off x="0" y="0"/>
+                            <a:ext cx="774000" cy="576000"/>
+                          </a:xfrm>
+                          <a:prstGeom prst="rect"/>
+                        </pic:spPr>
+                      </pic:pic>
+                    </a:graphicData>
+                  </a:graphic>
+                </wp:inline>
+              </w:drawing>
+            </w:r>
+          </w:p>
+        </w:tc>
+        <w:tc>
+          <w:tcPr>
+            <w:tcW w:type="dxa" w:w="13041"/>
+            <w:tcBorders>
+              <w:top w:val="single" w:sz="10" w:color="000000"/>
+              <w:left w:val="single" w:sz="10" w:color="000000"/>
+              <w:bottom w:val="single" w:sz="10" w:color="000000"/>
+              <w:right w:val="single" w:sz="10" w:color="000000"/>
+            </w:tcBorders>
+            <w:tcMar>
+              <w:top w:w="45" w:type="dxa"/>
+              <w:start w:w="55" w:type="dxa"/>
+              <w:bottom w:w="45" w:type="dxa"/>
+              <w:end w:w="55" w:type="dxa"/>
+            </w:tcMar>
+            <w:vAlign w:val="center"/>
+          </w:tcPr>
+          <w:p>
+            <w:pPr>
+              <w:spacing w:after="0" w:before="0"/>
+              <w:jc w:val="center"/>
+            </w:pPr>
             <w:r>
               <w:rPr>
+                <w:rFonts w:ascii="Times New Roman" w:hAnsi="Times New Roman" w:eastAsia="Times New Roman"/>
                 <w:b/>
-                <w:sz w:val="18"/>
+                <w:i w:val="0"/>
+                <w:sz w:val="50"/>
+              </w:rPr>
+              <w:t>HOÀNG ANH OWIN</w:t>
+            </w:r>
+          </w:p>
+        </w:tc>
+      </w:tr>
+    </w:tbl>
+    <w:tbl>
+      <w:tblPr>
+        <w:tblW w:type="dxa" w:w="15989"/>
+        <w:jc w:val="center"/>
+        <w:tblLayout w:type="fixed"/>
+        <w:tblLook w:firstColumn="1" w:firstRow="1" w:lastColumn="0" w:lastRow="0" w:noHBand="0" w:noVBand="1" w:val="04A0"/>
+      </w:tblPr>
+      <w:tblGrid>
+        <w:gridCol w:w="16158"/>
+      </w:tblGrid>
+      <w:tr>
+        <w:trPr>
+          <w:trHeight w:val="510" w:hRule="atLeast"/>
+        </w:trPr>
+        <w:tc>
+          <w:tcPr>
+            <w:tcW w:type="dxa" w:w="16158"/>
+            <w:tcBorders>
+              <w:top w:val="single" w:sz="10" w:color="000000"/>
+              <w:left w:val="single" w:sz="10" w:color="000000"/>
+              <w:bottom w:val="single" w:sz="10" w:color="000000"/>
+              <w:right w:val="single" w:sz="10" w:color="000000"/>
+            </w:tcBorders>
+            <w:shd w:fill="4B6078"/>
+            <w:vAlign w:val="center"/>
+            <w:tcMar>
+              <w:top w:w="45" w:type="dxa"/>
+              <w:start w:w="55" w:type="dxa"/>
+              <w:bottom w:w="45" w:type="dxa"/>
+              <w:end w:w="55" w:type="dxa"/>
+            </w:tcMar>
+          </w:tcPr>
+          <w:p>
+            <w:pPr>
+              <w:spacing w:after="0" w:before="0"/>
+              <w:jc w:val="center"/>
+            </w:pPr>
+            <w:r>
+              <w:rPr>
+                <w:rFonts w:ascii="Times New Roman" w:hAnsi="Times New Roman" w:eastAsia="Times New Roman"/>
+                <w:b/>
+                <w:i w:val="0"/>
+                <w:color w:val="FFFFFF"/>
+                <w:sz w:val="31"/>
+              </w:rPr>
+              <w:t>BẢNG GIÁ NHÔM OWIN LẮP ĐẶT HOÀN THIỆN</w:t>
+            </w:r>
+          </w:p>
+        </w:tc>
+      </w:tr>
+    </w:tbl>
+    <w:p>
+      <w:pPr>
+        <w:spacing w:after="40" w:before="0"/>
+      </w:pPr>
+    </w:p>
+    <w:tbl>
+      <w:tblPr>
+        <w:tblW w:type="dxa" w:w="14515"/>
+        <w:jc w:val="center"/>
+        <w:tblLayout w:type="fixed"/>
+        <w:tblLook w:firstColumn="1" w:firstRow="1" w:lastColumn="0" w:lastRow="0" w:noHBand="0" w:noVBand="1" w:val="04A0"/>
+      </w:tblPr>
+      <w:tblGrid>
+        <w:gridCol w:w="510"/>
+        <w:gridCol w:w="2891"/>
+        <w:gridCol w:w="4082"/>
+        <w:gridCol w:w="510"/>
+        <w:gridCol w:w="652"/>
+        <w:gridCol w:w="567"/>
+        <w:gridCol w:w="623"/>
+        <w:gridCol w:w="1559"/>
+        <w:gridCol w:w="1559"/>
+        <w:gridCol w:w="1559"/>
+      </w:tblGrid>
+      <w:tr>
+        <w:trPr>
+          <w:tblHeader w:val="true"/>
+          <w:trHeight w:val="464" w:hRule="atLeast"/>
+        </w:trPr>
+        <w:tc>
+          <w:tcPr>
+            <w:tcW w:type="dxa" w:w="510"/>
+            <w:shd w:fill="0E2F44"/>
+            <w:vAlign w:val="center"/>
+            <w:tcMar>
+              <w:top w:w="45" w:type="dxa"/>
+              <w:start w:w="55" w:type="dxa"/>
+              <w:bottom w:w="45" w:type="dxa"/>
+              <w:end w:w="55" w:type="dxa"/>
+            </w:tcMar>
+            <w:tcBorders>
+              <w:top w:val="single" w:sz="8" w:color="000000"/>
+              <w:left w:val="single" w:sz="8" w:color="000000"/>
+              <w:bottom w:val="single" w:sz="8" w:color="000000"/>
+              <w:right w:val="single" w:sz="8" w:color="000000"/>
+            </w:tcBorders>
+          </w:tcPr>
+          <w:p>
+            <w:pPr>
+              <w:spacing w:after="0" w:before="0"/>
+              <w:jc w:val="center"/>
+            </w:pPr>
+            <w:r>
+              <w:rPr>
+                <w:rFonts w:ascii="Times New Roman" w:hAnsi="Times New Roman" w:eastAsia="Times New Roman"/>
+                <w:b/>
+                <w:i w:val="0"/>
+                <w:color w:val="FFFFFF"/>
+                <w:sz w:val="19"/>
               </w:rPr>
               <w:t>STT</w:t>
             </w:r>
@@ -76,104 +227,244 @@
         </w:tc>
         <w:tc>
           <w:tcPr>
-            <w:tcW w:type="dxa" w:w="960"/>
+            <w:tcW w:type="dxa" w:w="2891"/>
+            <w:shd w:fill="0E2F44"/>
+            <w:vAlign w:val="center"/>
+            <w:tcMar>
+              <w:top w:w="45" w:type="dxa"/>
+              <w:start w:w="55" w:type="dxa"/>
+              <w:bottom w:w="45" w:type="dxa"/>
+              <w:end w:w="55" w:type="dxa"/>
+            </w:tcMar>
+            <w:tcBorders>
+              <w:top w:val="single" w:sz="8" w:color="000000"/>
+              <w:left w:val="single" w:sz="8" w:color="000000"/>
+              <w:bottom w:val="single" w:sz="8" w:color="000000"/>
+              <w:right w:val="single" w:sz="8" w:color="000000"/>
+            </w:tcBorders>
           </w:tcPr>
           <w:p>
-            <w:r/>
+            <w:pPr>
+              <w:spacing w:after="0" w:before="0"/>
+              <w:jc w:val="center"/>
+            </w:pPr>
             <w:r>
               <w:rPr>
+                <w:rFonts w:ascii="Times New Roman" w:hAnsi="Times New Roman" w:eastAsia="Times New Roman"/>
                 <w:b/>
-                <w:sz w:val="18"/>
+                <w:i w:val="0"/>
+                <w:color w:val="FFFFFF"/>
+                <w:sz w:val="19"/>
               </w:rPr>
-              <w:t>Ảnh</w:t>
+              <w:t>Hình ảnh</w:t>
             </w:r>
           </w:p>
         </w:tc>
         <w:tc>
           <w:tcPr>
-            <w:tcW w:type="dxa" w:w="960"/>
+            <w:tcW w:type="dxa" w:w="4082"/>
+            <w:shd w:fill="0E2F44"/>
+            <w:vAlign w:val="center"/>
+            <w:tcMar>
+              <w:top w:w="45" w:type="dxa"/>
+              <w:start w:w="55" w:type="dxa"/>
+              <w:bottom w:w="45" w:type="dxa"/>
+              <w:end w:w="55" w:type="dxa"/>
+            </w:tcMar>
+            <w:tcBorders>
+              <w:top w:val="single" w:sz="8" w:color="000000"/>
+              <w:left w:val="single" w:sz="8" w:color="000000"/>
+              <w:bottom w:val="single" w:sz="8" w:color="000000"/>
+              <w:right w:val="single" w:sz="8" w:color="000000"/>
+            </w:tcBorders>
           </w:tcPr>
           <w:p>
-            <w:r/>
+            <w:pPr>
+              <w:spacing w:after="0" w:before="0"/>
+              <w:jc w:val="center"/>
+            </w:pPr>
             <w:r>
               <w:rPr>
+                <w:rFonts w:ascii="Times New Roman" w:hAnsi="Times New Roman" w:eastAsia="Times New Roman"/>
                 <w:b/>
-                <w:sz w:val="18"/>
+                <w:i w:val="0"/>
+                <w:color w:val="FFFFFF"/>
+                <w:sz w:val="19"/>
               </w:rPr>
-              <w:t>Mã</w:t>
+              <w:t>Mô tả chi tiết</w:t>
             </w:r>
           </w:p>
         </w:tc>
         <w:tc>
           <w:tcPr>
-            <w:tcW w:type="dxa" w:w="960"/>
+            <w:tcW w:type="dxa" w:w="510"/>
+            <w:shd w:fill="0E2F44"/>
+            <w:vAlign w:val="center"/>
+            <w:tcMar>
+              <w:top w:w="45" w:type="dxa"/>
+              <w:start w:w="55" w:type="dxa"/>
+              <w:bottom w:w="45" w:type="dxa"/>
+              <w:end w:w="55" w:type="dxa"/>
+            </w:tcMar>
+            <w:tcBorders>
+              <w:top w:val="single" w:sz="8" w:color="000000"/>
+              <w:left w:val="single" w:sz="8" w:color="000000"/>
+              <w:bottom w:val="single" w:sz="8" w:color="000000"/>
+              <w:right w:val="single" w:sz="8" w:color="000000"/>
+            </w:tcBorders>
           </w:tcPr>
           <w:p>
-            <w:r/>
+            <w:pPr>
+              <w:spacing w:after="0" w:before="0"/>
+              <w:jc w:val="center"/>
+            </w:pPr>
             <w:r>
               <w:rPr>
+                <w:rFonts w:ascii="Times New Roman" w:hAnsi="Times New Roman" w:eastAsia="Times New Roman"/>
                 <w:b/>
-                <w:sz w:val="18"/>
+                <w:i w:val="0"/>
+                <w:color w:val="FFFFFF"/>
+                <w:sz w:val="19"/>
               </w:rPr>
-              <w:t>Mô tả</w:t>
+              <w:t>DV</w:t>
             </w:r>
           </w:p>
         </w:tc>
         <w:tc>
           <w:tcPr>
-            <w:tcW w:type="dxa" w:w="960"/>
+            <w:tcW w:type="dxa" w:w="652"/>
+            <w:shd w:fill="0E2F44"/>
+            <w:vAlign w:val="center"/>
+            <w:tcMar>
+              <w:top w:w="45" w:type="dxa"/>
+              <w:start w:w="55" w:type="dxa"/>
+              <w:bottom w:w="45" w:type="dxa"/>
+              <w:end w:w="55" w:type="dxa"/>
+            </w:tcMar>
+            <w:tcBorders>
+              <w:top w:val="single" w:sz="8" w:color="000000"/>
+              <w:left w:val="single" w:sz="8" w:color="000000"/>
+              <w:bottom w:val="single" w:sz="8" w:color="000000"/>
+              <w:right w:val="single" w:sz="8" w:color="000000"/>
+            </w:tcBorders>
           </w:tcPr>
           <w:p>
-            <w:r/>
+            <w:pPr>
+              <w:spacing w:after="0" w:before="0"/>
+              <w:jc w:val="center"/>
+            </w:pPr>
             <w:r>
               <w:rPr>
+                <w:rFonts w:ascii="Times New Roman" w:hAnsi="Times New Roman" w:eastAsia="Times New Roman"/>
                 <w:b/>
-                <w:sz w:val="18"/>
+                <w:i w:val="0"/>
+                <w:color w:val="FFFFFF"/>
+                <w:sz w:val="19"/>
               </w:rPr>
-              <w:t>Kích thước</w:t>
+              <w:t>Rộng</w:t>
             </w:r>
           </w:p>
         </w:tc>
         <w:tc>
           <w:tcPr>
-            <w:tcW w:type="dxa" w:w="960"/>
+            <w:tcW w:type="dxa" w:w="567"/>
+            <w:shd w:fill="0E2F44"/>
+            <w:vAlign w:val="center"/>
+            <w:tcMar>
+              <w:top w:w="45" w:type="dxa"/>
+              <w:start w:w="55" w:type="dxa"/>
+              <w:bottom w:w="45" w:type="dxa"/>
+              <w:end w:w="55" w:type="dxa"/>
+            </w:tcMar>
+            <w:tcBorders>
+              <w:top w:val="single" w:sz="8" w:color="000000"/>
+              <w:left w:val="single" w:sz="8" w:color="000000"/>
+              <w:bottom w:val="single" w:sz="8" w:color="000000"/>
+              <w:right w:val="single" w:sz="8" w:color="000000"/>
+            </w:tcBorders>
           </w:tcPr>
           <w:p>
-            <w:r/>
+            <w:pPr>
+              <w:spacing w:after="0" w:before="0"/>
+              <w:jc w:val="center"/>
+            </w:pPr>
             <w:r>
               <w:rPr>
+                <w:rFonts w:ascii="Times New Roman" w:hAnsi="Times New Roman" w:eastAsia="Times New Roman"/>
                 <w:b/>
-                <w:sz w:val="18"/>
+                <w:i w:val="0"/>
+                <w:color w:val="FFFFFF"/>
+                <w:sz w:val="19"/>
               </w:rPr>
-              <w:t>ĐVT</w:t>
+              <w:t>Cao</w:t>
             </w:r>
           </w:p>
         </w:tc>
         <w:tc>
           <w:tcPr>
-            <w:tcW w:type="dxa" w:w="960"/>
+            <w:tcW w:type="dxa" w:w="623"/>
+            <w:shd w:fill="0E2F44"/>
+            <w:vAlign w:val="center"/>
+            <w:tcMar>
+              <w:top w:w="45" w:type="dxa"/>
+              <w:start w:w="55" w:type="dxa"/>
+              <w:bottom w:w="45" w:type="dxa"/>
+              <w:end w:w="55" w:type="dxa"/>
+            </w:tcMar>
+            <w:tcBorders>
+              <w:top w:val="single" w:sz="8" w:color="000000"/>
+              <w:left w:val="single" w:sz="8" w:color="000000"/>
+              <w:bottom w:val="single" w:sz="8" w:color="000000"/>
+              <w:right w:val="single" w:sz="8" w:color="000000"/>
+            </w:tcBorders>
           </w:tcPr>
           <w:p>
-            <w:r/>
+            <w:pPr>
+              <w:spacing w:after="0" w:before="0"/>
+              <w:jc w:val="center"/>
+            </w:pPr>
             <w:r>
               <w:rPr>
+                <w:rFonts w:ascii="Times New Roman" w:hAnsi="Times New Roman" w:eastAsia="Times New Roman"/>
                 <w:b/>
-                <w:sz w:val="18"/>
+                <w:i w:val="0"/>
+                <w:color w:val="FFFFFF"/>
+                <w:sz w:val="19"/>
               </w:rPr>
-              <w:t>SL</w:t>
+              <w:t>KL</w:t>
             </w:r>
           </w:p>
         </w:tc>
         <w:tc>
           <w:tcPr>
-            <w:tcW w:type="dxa" w:w="960"/>
+            <w:tcW w:type="dxa" w:w="1559"/>
+            <w:shd w:fill="0E2F44"/>
+            <w:vAlign w:val="center"/>
+            <w:tcMar>
+              <w:top w:w="45" w:type="dxa"/>
+              <w:start w:w="55" w:type="dxa"/>
+              <w:bottom w:w="45" w:type="dxa"/>
+              <w:end w:w="55" w:type="dxa"/>
+            </w:tcMar>
+            <w:tcBorders>
+              <w:top w:val="single" w:sz="8" w:color="000000"/>
+              <w:left w:val="single" w:sz="8" w:color="000000"/>
+              <w:bottom w:val="single" w:sz="8" w:color="000000"/>
+              <w:right w:val="single" w:sz="8" w:color="000000"/>
+            </w:tcBorders>
           </w:tcPr>
           <w:p>
-            <w:r/>
+            <w:pPr>
+              <w:spacing w:after="0" w:before="0"/>
+              <w:jc w:val="center"/>
+            </w:pPr>
             <w:r>
               <w:rPr>
+                <w:rFonts w:ascii="Times New Roman" w:hAnsi="Times New Roman" w:eastAsia="Times New Roman"/>
                 <w:b/>
-                <w:sz w:val="18"/>
+                <w:i w:val="0"/>
+                <w:color w:val="FFFFFF"/>
+                <w:sz w:val="19"/>
               </w:rPr>
               <w:t>Đơn giá</w:t>
             </w:r>
@@ -181,135 +472,379 @@
         </w:tc>
         <w:tc>
           <w:tcPr>
-            <w:tcW w:type="dxa" w:w="960"/>
+            <w:tcW w:type="dxa" w:w="1559"/>
+            <w:shd w:fill="0E2F44"/>
+            <w:vAlign w:val="center"/>
+            <w:tcMar>
+              <w:top w:w="45" w:type="dxa"/>
+              <w:start w:w="55" w:type="dxa"/>
+              <w:bottom w:w="45" w:type="dxa"/>
+              <w:end w:w="55" w:type="dxa"/>
+            </w:tcMar>
+            <w:tcBorders>
+              <w:top w:val="single" w:sz="8" w:color="000000"/>
+              <w:left w:val="single" w:sz="8" w:color="000000"/>
+              <w:bottom w:val="single" w:sz="8" w:color="000000"/>
+              <w:right w:val="single" w:sz="8" w:color="000000"/>
+            </w:tcBorders>
           </w:tcPr>
           <w:p>
-            <w:r/>
+            <w:pPr>
+              <w:spacing w:after="0" w:before="0"/>
+              <w:jc w:val="center"/>
+            </w:pPr>
             <w:r>
               <w:rPr>
+                <w:rFonts w:ascii="Times New Roman" w:hAnsi="Times New Roman" w:eastAsia="Times New Roman"/>
                 <w:b/>
-                <w:sz w:val="18"/>
+                <w:i w:val="0"/>
+                <w:color w:val="FFFFFF"/>
+                <w:sz w:val="19"/>
               </w:rPr>
               <w:t>Thành tiền</w:t>
             </w:r>
           </w:p>
         </w:tc>
+        <w:tc>
+          <w:tcPr>
+            <w:tcW w:type="dxa" w:w="1559"/>
+            <w:shd w:fill="0E2F44"/>
+            <w:vAlign w:val="center"/>
+            <w:tcMar>
+              <w:top w:w="45" w:type="dxa"/>
+              <w:start w:w="55" w:type="dxa"/>
+              <w:bottom w:w="45" w:type="dxa"/>
+              <w:end w:w="55" w:type="dxa"/>
+            </w:tcMar>
+            <w:tcBorders>
+              <w:top w:val="single" w:sz="8" w:color="000000"/>
+              <w:left w:val="single" w:sz="8" w:color="000000"/>
+              <w:bottom w:val="single" w:sz="8" w:color="000000"/>
+              <w:right w:val="single" w:sz="8" w:color="000000"/>
+            </w:tcBorders>
+          </w:tcPr>
+          <w:p>
+            <w:pPr>
+              <w:spacing w:after="0" w:before="0"/>
+              <w:jc w:val="center"/>
+            </w:pPr>
+            <w:r>
+              <w:rPr>
+                <w:rFonts w:ascii="Times New Roman" w:hAnsi="Times New Roman" w:eastAsia="Times New Roman"/>
+                <w:b/>
+                <w:i w:val="0"/>
+                <w:color w:val="FFFFFF"/>
+                <w:sz w:val="19"/>
+              </w:rPr>
+              <w:t>Tổng tiền</w:t>
+            </w:r>
+          </w:p>
+        </w:tc>
       </w:tr>
       <w:tr>
+        <w:trPr>
+          <w:trHeight w:val="368" w:hRule="atLeast"/>
+        </w:trPr>
         <w:tc>
           <w:tcPr>
-            <w:tcW w:type="dxa" w:w="960"/>
+            <w:tcW w:type="dxa" w:w="1559"/>
+            <w:gridSpan w:val="10"/>
+            <w:shd w:fill="D9E2F3"/>
+            <w:vAlign w:val="center"/>
+            <w:tcMar>
+              <w:top w:w="45" w:type="dxa"/>
+              <w:start w:w="55" w:type="dxa"/>
+              <w:bottom w:w="45" w:type="dxa"/>
+              <w:end w:w="55" w:type="dxa"/>
+            </w:tcMar>
+            <w:tcBorders>
+              <w:top w:val="single" w:sz="8" w:color="000000"/>
+              <w:left w:val="single" w:sz="8" w:color="000000"/>
+              <w:bottom w:val="single" w:sz="8" w:color="000000"/>
+              <w:right w:val="single" w:sz="8" w:color="000000"/>
+            </w:tcBorders>
           </w:tcPr>
           <w:p>
-            <w:r/>
+            <w:pPr>
+              <w:spacing w:after="0" w:before="0"/>
+              <w:jc w:val="left"/>
+            </w:pPr>
             <w:r>
               <w:rPr>
-                <w:b w:val="0"/>
-                <w:sz w:val="18"/>
+                <w:rFonts w:ascii="Times New Roman" w:hAnsi="Times New Roman" w:eastAsia="Times New Roman"/>
+                <w:b/>
+                <w:i w:val="0"/>
+                <w:sz w:val="20"/>
               </w:rPr>
-              <w:t>{#items}{stt}</w:t>
+              <w:t>{category}</w:t>
+            </w:r>
+          </w:p>
+        </w:tc>
+      </w:tr>
+      <w:tr>
+        <w:trPr>
+          <w:trHeight w:val="1530" w:hRule="atLeast"/>
+        </w:trPr>
+        <w:tc>
+          <w:tcPr>
+            <w:tcW w:type="dxa" w:w="510"/>
+            <w:vMerge w:val="restart"/>
+            <w:vAlign w:val="center"/>
+            <w:tcMar>
+              <w:top w:w="45" w:type="dxa"/>
+              <w:start w:w="55" w:type="dxa"/>
+              <w:bottom w:w="45" w:type="dxa"/>
+              <w:end w:w="55" w:type="dxa"/>
+            </w:tcMar>
+            <w:tcBorders>
+              <w:top w:val="single" w:sz="8" w:color="000000"/>
+              <w:left w:val="single" w:sz="8" w:color="000000"/>
+              <w:bottom w:val="single" w:sz="8" w:color="000000"/>
+              <w:right w:val="single" w:sz="8" w:color="000000"/>
+            </w:tcBorders>
+          </w:tcPr>
+          <w:p>
+            <w:pPr>
+              <w:spacing w:after="0" w:before="0"/>
+              <w:jc w:val="center"/>
+            </w:pPr>
+            <w:r>
+              <w:rPr>
+                <w:rFonts w:ascii="Times New Roman" w:hAnsi="Times New Roman" w:eastAsia="Times New Roman"/>
+                <w:b/>
+                <w:i w:val="0"/>
+                <w:sz w:val="19"/>
+              </w:rPr>
+              <w:t>{stt}</w:t>
             </w:r>
           </w:p>
         </w:tc>
         <w:tc>
           <w:tcPr>
-            <w:tcW w:type="dxa" w:w="960"/>
+            <w:tcW w:type="dxa" w:w="2891"/>
+            <w:vMerge w:val="restart"/>
+            <w:tcBorders>
+              <w:top w:val="single" w:sz="8" w:color="000000"/>
+              <w:left w:val="single" w:sz="8" w:color="000000"/>
+              <w:bottom w:val="single" w:sz="8" w:color="000000"/>
+              <w:right w:val="single" w:sz="8" w:color="000000"/>
+            </w:tcBorders>
+            <w:vAlign w:val="center"/>
+            <w:tcMar>
+              <w:top w:w="45" w:type="dxa"/>
+              <w:start w:w="55" w:type="dxa"/>
+              <w:bottom w:w="45" w:type="dxa"/>
+              <w:end w:w="55" w:type="dxa"/>
+            </w:tcMar>
           </w:tcPr>
           <w:p>
-            <w:r/>
+            <w:pPr>
+              <w:spacing w:before="0" w:after="0"/>
+              <w:jc w:val="center"/>
+            </w:pPr>
             <w:r>
               <w:rPr>
-                <w:b w:val="0"/>
-                <w:sz w:val="18"/>
+                <w:rFonts w:ascii="Times New Roman" w:hAnsi="Times New Roman" w:eastAsia="Times New Roman"/>
+                <w:b/>
+                <w:i w:val="0"/>
+                <w:sz w:val="17"/>
               </w:rPr>
-              <w:t>{%image}</w:t>
+              <w:t>{image}</w:t>
             </w:r>
           </w:p>
         </w:tc>
         <w:tc>
           <w:tcPr>
-            <w:tcW w:type="dxa" w:w="960"/>
+            <w:tcW w:type="dxa" w:w="4082"/>
+            <w:vAlign w:val="center"/>
+            <w:tcMar>
+              <w:top w:w="45" w:type="dxa"/>
+              <w:start w:w="55" w:type="dxa"/>
+              <w:bottom w:w="45" w:type="dxa"/>
+              <w:end w:w="55" w:type="dxa"/>
+            </w:tcMar>
+            <w:tcBorders>
+              <w:top w:val="single" w:sz="8" w:color="000000"/>
+              <w:left w:val="single" w:sz="8" w:color="000000"/>
+              <w:bottom w:val="single" w:sz="8" w:color="000000"/>
+              <w:right w:val="single" w:sz="8" w:color="000000"/>
+            </w:tcBorders>
           </w:tcPr>
           <w:p>
-            <w:r/>
+            <w:pPr>
+              <w:spacing w:after="0" w:before="0"/>
+              <w:jc w:val="left"/>
+            </w:pPr>
             <w:r>
               <w:rPr>
-                <w:b w:val="0"/>
-                <w:sz w:val="18"/>
+                <w:rFonts w:ascii="Times New Roman" w:hAnsi="Times New Roman" w:eastAsia="Times New Roman"/>
+                <w:b/>
+                <w:i w:val="0"/>
+                <w:sz w:val="17"/>
               </w:rPr>
-              <w:t>{ma}</w:t>
+              <w:t>{product_info_block}</w:t>
             </w:r>
           </w:p>
         </w:tc>
         <w:tc>
           <w:tcPr>
-            <w:tcW w:type="dxa" w:w="960"/>
+            <w:tcW w:type="dxa" w:w="510"/>
+            <w:vAlign w:val="center"/>
+            <w:tcMar>
+              <w:top w:w="45" w:type="dxa"/>
+              <w:start w:w="55" w:type="dxa"/>
+              <w:bottom w:w="45" w:type="dxa"/>
+              <w:end w:w="55" w:type="dxa"/>
+            </w:tcMar>
+            <w:tcBorders>
+              <w:top w:val="single" w:sz="8" w:color="000000"/>
+              <w:left w:val="single" w:sz="8" w:color="000000"/>
+              <w:bottom w:val="single" w:sz="8" w:color="000000"/>
+              <w:right w:val="single" w:sz="8" w:color="000000"/>
+            </w:tcBorders>
           </w:tcPr>
           <w:p>
-            <w:r/>
+            <w:pPr>
+              <w:spacing w:after="0" w:before="0"/>
+              <w:jc w:val="center"/>
+            </w:pPr>
             <w:r>
               <w:rPr>
-                <w:b w:val="0"/>
+                <w:rFonts w:ascii="Times New Roman" w:hAnsi="Times New Roman" w:eastAsia="Times New Roman"/>
+                <w:b/>
+                <w:i w:val="0"/>
                 <w:sz w:val="18"/>
               </w:rPr>
-              <w:t>{mo_ta}</w:t>
+              <w:t>{dv}</w:t>
             </w:r>
           </w:p>
         </w:tc>
         <w:tc>
           <w:tcPr>
-            <w:tcW w:type="dxa" w:w="960"/>
+            <w:tcW w:type="dxa" w:w="652"/>
+            <w:vAlign w:val="center"/>
+            <w:tcMar>
+              <w:top w:w="45" w:type="dxa"/>
+              <w:start w:w="55" w:type="dxa"/>
+              <w:bottom w:w="45" w:type="dxa"/>
+              <w:end w:w="55" w:type="dxa"/>
+            </w:tcMar>
+            <w:tcBorders>
+              <w:top w:val="single" w:sz="8" w:color="000000"/>
+              <w:left w:val="single" w:sz="8" w:color="000000"/>
+              <w:bottom w:val="single" w:sz="8" w:color="000000"/>
+              <w:right w:val="single" w:sz="8" w:color="000000"/>
+            </w:tcBorders>
           </w:tcPr>
           <w:p>
-            <w:r/>
+            <w:pPr>
+              <w:spacing w:after="0" w:before="0"/>
+              <w:jc w:val="center"/>
+            </w:pPr>
             <w:r>
               <w:rPr>
-                <w:b w:val="0"/>
+                <w:rFonts w:ascii="Times New Roman" w:hAnsi="Times New Roman" w:eastAsia="Times New Roman"/>
+                <w:b/>
+                <w:i w:val="0"/>
                 <w:sz w:val="18"/>
               </w:rPr>
-              <w:t>{kich_thuoc}</w:t>
+              <w:t>{rong}</w:t>
             </w:r>
           </w:p>
         </w:tc>
         <w:tc>
           <w:tcPr>
-            <w:tcW w:type="dxa" w:w="960"/>
+            <w:tcW w:type="dxa" w:w="567"/>
+            <w:vAlign w:val="center"/>
+            <w:tcMar>
+              <w:top w:w="45" w:type="dxa"/>
+              <w:start w:w="55" w:type="dxa"/>
+              <w:bottom w:w="45" w:type="dxa"/>
+              <w:end w:w="55" w:type="dxa"/>
+            </w:tcMar>
+            <w:tcBorders>
+              <w:top w:val="single" w:sz="8" w:color="000000"/>
+              <w:left w:val="single" w:sz="8" w:color="000000"/>
+              <w:bottom w:val="single" w:sz="8" w:color="000000"/>
+              <w:right w:val="single" w:sz="8" w:color="000000"/>
+            </w:tcBorders>
           </w:tcPr>
           <w:p>
-            <w:r/>
+            <w:pPr>
+              <w:spacing w:after="0" w:before="0"/>
+              <w:jc w:val="center"/>
+            </w:pPr>
             <w:r>
               <w:rPr>
-                <w:b w:val="0"/>
+                <w:rFonts w:ascii="Times New Roman" w:hAnsi="Times New Roman" w:eastAsia="Times New Roman"/>
+                <w:b/>
+                <w:i w:val="0"/>
                 <w:sz w:val="18"/>
               </w:rPr>
-              <w:t>{dvt}</w:t>
+              <w:t>{cao}</w:t>
             </w:r>
           </w:p>
         </w:tc>
         <w:tc>
           <w:tcPr>
-            <w:tcW w:type="dxa" w:w="960"/>
+            <w:tcW w:type="dxa" w:w="623"/>
+            <w:vAlign w:val="center"/>
+            <w:tcMar>
+              <w:top w:w="45" w:type="dxa"/>
+              <w:start w:w="55" w:type="dxa"/>
+              <w:bottom w:w="45" w:type="dxa"/>
+              <w:end w:w="55" w:type="dxa"/>
+            </w:tcMar>
+            <w:tcBorders>
+              <w:top w:val="single" w:sz="8" w:color="000000"/>
+              <w:left w:val="single" w:sz="8" w:color="000000"/>
+              <w:bottom w:val="single" w:sz="8" w:color="000000"/>
+              <w:right w:val="single" w:sz="8" w:color="000000"/>
+            </w:tcBorders>
           </w:tcPr>
           <w:p>
-            <w:r/>
+            <w:pPr>
+              <w:spacing w:after="0" w:before="0"/>
+              <w:jc w:val="center"/>
+            </w:pPr>
             <w:r>
               <w:rPr>
-                <w:b w:val="0"/>
+                <w:rFonts w:ascii="Times New Roman" w:hAnsi="Times New Roman" w:eastAsia="Times New Roman"/>
+                <w:b/>
+                <w:i w:val="0"/>
                 <w:sz w:val="18"/>
               </w:rPr>
-              <w:t>{sl}</w:t>
+              <w:t>{kl}</w:t>
             </w:r>
           </w:p>
         </w:tc>
         <w:tc>
           <w:tcPr>
-            <w:tcW w:type="dxa" w:w="960"/>
+            <w:tcW w:type="dxa" w:w="1559"/>
+            <w:vAlign w:val="center"/>
+            <w:tcMar>
+              <w:top w:w="45" w:type="dxa"/>
+              <w:start w:w="55" w:type="dxa"/>
+              <w:bottom w:w="45" w:type="dxa"/>
+              <w:end w:w="55" w:type="dxa"/>
+            </w:tcMar>
+            <w:tcBorders>
+              <w:top w:val="single" w:sz="8" w:color="000000"/>
+              <w:left w:val="single" w:sz="8" w:color="000000"/>
+              <w:bottom w:val="single" w:sz="8" w:color="000000"/>
+              <w:right w:val="single" w:sz="8" w:color="000000"/>
+            </w:tcBorders>
           </w:tcPr>
           <w:p>
-            <w:r/>
+            <w:pPr>
+              <w:spacing w:after="0" w:before="0"/>
+              <w:jc w:val="right"/>
+            </w:pPr>
             <w:r>
               <w:rPr>
-                <w:b w:val="0"/>
+                <w:rFonts w:ascii="Times New Roman" w:hAnsi="Times New Roman" w:eastAsia="Times New Roman"/>
+                <w:b/>
+                <w:i w:val="0"/>
                 <w:sz w:val="18"/>
               </w:rPr>
               <w:t>{don_gia}</w:t>
@@ -318,62 +853,334 @@
         </w:tc>
         <w:tc>
           <w:tcPr>
-            <w:tcW w:type="dxa" w:w="960"/>
+            <w:tcW w:type="dxa" w:w="1559"/>
+            <w:vAlign w:val="center"/>
+            <w:tcMar>
+              <w:top w:w="45" w:type="dxa"/>
+              <w:start w:w="55" w:type="dxa"/>
+              <w:bottom w:w="45" w:type="dxa"/>
+              <w:end w:w="55" w:type="dxa"/>
+            </w:tcMar>
+            <w:tcBorders>
+              <w:top w:val="single" w:sz="8" w:color="000000"/>
+              <w:left w:val="single" w:sz="8" w:color="000000"/>
+              <w:bottom w:val="single" w:sz="8" w:color="000000"/>
+              <w:right w:val="single" w:sz="8" w:color="000000"/>
+            </w:tcBorders>
           </w:tcPr>
           <w:p>
-            <w:r/>
+            <w:pPr>
+              <w:spacing w:after="0" w:before="0"/>
+              <w:jc w:val="right"/>
+            </w:pPr>
             <w:r>
               <w:rPr>
-                <w:b w:val="0"/>
+                <w:rFonts w:ascii="Times New Roman" w:hAnsi="Times New Roman" w:eastAsia="Times New Roman"/>
+                <w:b/>
+                <w:i w:val="0"/>
                 <w:sz w:val="18"/>
               </w:rPr>
-              <w:t>{thanh_tien}{/items}</w:t>
+              <w:t>{thanh_tien}</w:t>
+            </w:r>
+          </w:p>
+        </w:tc>
+        <w:tc>
+          <w:tcPr>
+            <w:tcW w:type="dxa" w:w="1559"/>
+            <w:vMerge w:val="restart"/>
+            <w:vAlign w:val="center"/>
+            <w:tcMar>
+              <w:top w:w="45" w:type="dxa"/>
+              <w:start w:w="55" w:type="dxa"/>
+              <w:bottom w:w="45" w:type="dxa"/>
+              <w:end w:w="55" w:type="dxa"/>
+            </w:tcMar>
+            <w:tcBorders>
+              <w:top w:val="single" w:sz="8" w:color="000000"/>
+              <w:left w:val="single" w:sz="8" w:color="000000"/>
+              <w:bottom w:val="single" w:sz="8" w:color="000000"/>
+              <w:right w:val="single" w:sz="8" w:color="000000"/>
+            </w:tcBorders>
+          </w:tcPr>
+          <w:p>
+            <w:pPr>
+              <w:spacing w:after="0" w:before="0"/>
+              <w:jc w:val="center"/>
+            </w:pPr>
+            <w:r>
+              <w:rPr>
+                <w:rFonts w:ascii="Times New Roman" w:hAnsi="Times New Roman" w:eastAsia="Times New Roman"/>
+                <w:b/>
+                <w:i w:val="0"/>
+                <w:color w:val="B7791F"/>
+                <w:sz w:val="20"/>
+              </w:rPr>
+              <w:t>{tong_tien}</w:t>
             </w:r>
           </w:p>
         </w:tc>
       </w:tr>
+      <w:tr>
+        <w:trPr>
+          <w:trHeight w:val="1530" w:hRule="atLeast"/>
+        </w:trPr>
+        <w:tc>
+          <w:tcPr>
+            <w:tcW w:type="dxa" w:w="510"/>
+            <w:vMerge w:val="continue"/>
+          </w:tcPr>
+          <w:p/>
+        </w:tc>
+        <w:tc>
+          <w:tcPr>
+            <w:tcW w:type="dxa" w:w="2891"/>
+            <w:vMerge w:val="continue"/>
+          </w:tcPr>
+          <w:p/>
+        </w:tc>
+        <w:tc>
+          <w:tcPr>
+            <w:tcW w:type="dxa" w:w="4082"/>
+            <w:vAlign w:val="center"/>
+            <w:tcMar>
+              <w:top w:w="45" w:type="dxa"/>
+              <w:start w:w="55" w:type="dxa"/>
+              <w:bottom w:w="45" w:type="dxa"/>
+              <w:end w:w="55" w:type="dxa"/>
+            </w:tcMar>
+            <w:tcBorders>
+              <w:top w:val="single" w:sz="8" w:color="000000"/>
+              <w:left w:val="single" w:sz="8" w:color="000000"/>
+              <w:bottom w:val="single" w:sz="8" w:color="000000"/>
+              <w:right w:val="single" w:sz="8" w:color="000000"/>
+            </w:tcBorders>
+          </w:tcPr>
+          <w:p>
+            <w:pPr>
+              <w:spacing w:after="0" w:before="0"/>
+              <w:jc w:val="left"/>
+            </w:pPr>
+            <w:r>
+              <w:rPr>
+                <w:rFonts w:ascii="Times New Roman" w:hAnsi="Times New Roman" w:eastAsia="Times New Roman"/>
+                <w:b/>
+                <w:i w:val="0"/>
+                <w:sz w:val="17"/>
+              </w:rPr>
+              <w:t>{accessory_block}</w:t>
+            </w:r>
+          </w:p>
+        </w:tc>
+        <w:tc>
+          <w:tcPr>
+            <w:tcW w:type="dxa" w:w="510"/>
+            <w:vAlign w:val="center"/>
+            <w:tcMar>
+              <w:top w:w="45" w:type="dxa"/>
+              <w:start w:w="55" w:type="dxa"/>
+              <w:bottom w:w="45" w:type="dxa"/>
+              <w:end w:w="55" w:type="dxa"/>
+            </w:tcMar>
+            <w:tcBorders>
+              <w:top w:val="single" w:sz="8" w:color="000000"/>
+              <w:left w:val="single" w:sz="8" w:color="000000"/>
+              <w:bottom w:val="single" w:sz="8" w:color="000000"/>
+              <w:right w:val="single" w:sz="8" w:color="000000"/>
+            </w:tcBorders>
+          </w:tcPr>
+          <w:p>
+            <w:pPr>
+              <w:spacing w:after="0" w:before="0"/>
+              <w:jc w:val="center"/>
+            </w:pPr>
+            <w:r>
+              <w:rPr>
+                <w:rFonts w:ascii="Times New Roman" w:hAnsi="Times New Roman" w:eastAsia="Times New Roman"/>
+                <w:b/>
+                <w:i w:val="0"/>
+                <w:sz w:val="18"/>
+              </w:rPr>
+              <w:t>{pk_dv}</w:t>
+            </w:r>
+          </w:p>
+        </w:tc>
+        <w:tc>
+          <w:tcPr>
+            <w:tcW w:type="dxa" w:w="652"/>
+            <w:vAlign w:val="center"/>
+            <w:tcMar>
+              <w:top w:w="45" w:type="dxa"/>
+              <w:start w:w="55" w:type="dxa"/>
+              <w:bottom w:w="45" w:type="dxa"/>
+              <w:end w:w="55" w:type="dxa"/>
+            </w:tcMar>
+            <w:tcBorders>
+              <w:top w:val="single" w:sz="8" w:color="000000"/>
+              <w:left w:val="single" w:sz="8" w:color="000000"/>
+              <w:bottom w:val="single" w:sz="8" w:color="000000"/>
+              <w:right w:val="single" w:sz="8" w:color="000000"/>
+            </w:tcBorders>
+          </w:tcPr>
+          <w:p>
+            <w:pPr>
+              <w:spacing w:after="0" w:before="0"/>
+              <w:jc w:val="center"/>
+            </w:pPr>
+            <w:r>
+              <w:rPr>
+                <w:rFonts w:ascii="Times New Roman" w:hAnsi="Times New Roman" w:eastAsia="Times New Roman"/>
+                <w:b/>
+                <w:i w:val="0"/>
+                <w:sz w:val="18"/>
+              </w:rPr>
+              <w:t>—</w:t>
+            </w:r>
+          </w:p>
+        </w:tc>
+        <w:tc>
+          <w:tcPr>
+            <w:tcW w:type="dxa" w:w="567"/>
+            <w:vAlign w:val="center"/>
+            <w:tcMar>
+              <w:top w:w="45" w:type="dxa"/>
+              <w:start w:w="55" w:type="dxa"/>
+              <w:bottom w:w="45" w:type="dxa"/>
+              <w:end w:w="55" w:type="dxa"/>
+            </w:tcMar>
+            <w:tcBorders>
+              <w:top w:val="single" w:sz="8" w:color="000000"/>
+              <w:left w:val="single" w:sz="8" w:color="000000"/>
+              <w:bottom w:val="single" w:sz="8" w:color="000000"/>
+              <w:right w:val="single" w:sz="8" w:color="000000"/>
+            </w:tcBorders>
+          </w:tcPr>
+          <w:p>
+            <w:pPr>
+              <w:spacing w:after="0" w:before="0"/>
+              <w:jc w:val="center"/>
+            </w:pPr>
+            <w:r>
+              <w:rPr>
+                <w:rFonts w:ascii="Times New Roman" w:hAnsi="Times New Roman" w:eastAsia="Times New Roman"/>
+                <w:b/>
+                <w:i w:val="0"/>
+                <w:sz w:val="18"/>
+              </w:rPr>
+              <w:t>—</w:t>
+            </w:r>
+          </w:p>
+        </w:tc>
+        <w:tc>
+          <w:tcPr>
+            <w:tcW w:type="dxa" w:w="623"/>
+            <w:vAlign w:val="center"/>
+            <w:tcMar>
+              <w:top w:w="45" w:type="dxa"/>
+              <w:start w:w="55" w:type="dxa"/>
+              <w:bottom w:w="45" w:type="dxa"/>
+              <w:end w:w="55" w:type="dxa"/>
+            </w:tcMar>
+            <w:tcBorders>
+              <w:top w:val="single" w:sz="8" w:color="000000"/>
+              <w:left w:val="single" w:sz="8" w:color="000000"/>
+              <w:bottom w:val="single" w:sz="8" w:color="000000"/>
+              <w:right w:val="single" w:sz="8" w:color="000000"/>
+            </w:tcBorders>
+          </w:tcPr>
+          <w:p>
+            <w:pPr>
+              <w:spacing w:after="0" w:before="0"/>
+              <w:jc w:val="center"/>
+            </w:pPr>
+            <w:r>
+              <w:rPr>
+                <w:rFonts w:ascii="Times New Roman" w:hAnsi="Times New Roman" w:eastAsia="Times New Roman"/>
+                <w:b/>
+                <w:i w:val="0"/>
+                <w:sz w:val="18"/>
+              </w:rPr>
+              <w:t>{pk_kl}</w:t>
+            </w:r>
+          </w:p>
+        </w:tc>
+        <w:tc>
+          <w:tcPr>
+            <w:tcW w:type="dxa" w:w="1559"/>
+            <w:vAlign w:val="center"/>
+            <w:tcMar>
+              <w:top w:w="45" w:type="dxa"/>
+              <w:start w:w="55" w:type="dxa"/>
+              <w:bottom w:w="45" w:type="dxa"/>
+              <w:end w:w="55" w:type="dxa"/>
+            </w:tcMar>
+            <w:tcBorders>
+              <w:top w:val="single" w:sz="8" w:color="000000"/>
+              <w:left w:val="single" w:sz="8" w:color="000000"/>
+              <w:bottom w:val="single" w:sz="8" w:color="000000"/>
+              <w:right w:val="single" w:sz="8" w:color="000000"/>
+            </w:tcBorders>
+          </w:tcPr>
+          <w:p>
+            <w:pPr>
+              <w:spacing w:after="0" w:before="0"/>
+              <w:jc w:val="right"/>
+            </w:pPr>
+            <w:r>
+              <w:rPr>
+                <w:rFonts w:ascii="Times New Roman" w:hAnsi="Times New Roman" w:eastAsia="Times New Roman"/>
+                <w:b/>
+                <w:i w:val="0"/>
+                <w:sz w:val="18"/>
+              </w:rPr>
+              <w:t>{pk_don_gia}</w:t>
+            </w:r>
+          </w:p>
+        </w:tc>
+        <w:tc>
+          <w:tcPr>
+            <w:tcW w:type="dxa" w:w="1559"/>
+            <w:vAlign w:val="center"/>
+            <w:tcMar>
+              <w:top w:w="45" w:type="dxa"/>
+              <w:start w:w="55" w:type="dxa"/>
+              <w:bottom w:w="45" w:type="dxa"/>
+              <w:end w:w="55" w:type="dxa"/>
+            </w:tcMar>
+            <w:tcBorders>
+              <w:top w:val="single" w:sz="8" w:color="000000"/>
+              <w:left w:val="single" w:sz="8" w:color="000000"/>
+              <w:bottom w:val="single" w:sz="8" w:color="000000"/>
+              <w:right w:val="single" w:sz="8" w:color="000000"/>
+            </w:tcBorders>
+          </w:tcPr>
+          <w:p>
+            <w:pPr>
+              <w:spacing w:after="0" w:before="0"/>
+              <w:jc w:val="right"/>
+            </w:pPr>
+            <w:r>
+              <w:rPr>
+                <w:rFonts w:ascii="Times New Roman" w:hAnsi="Times New Roman" w:eastAsia="Times New Roman"/>
+                <w:b/>
+                <w:i w:val="0"/>
+                <w:sz w:val="18"/>
+              </w:rPr>
+              <w:t>{pk_thanh_tien}</w:t>
+            </w:r>
+          </w:p>
+        </w:tc>
+        <w:tc>
+          <w:tcPr>
+            <w:tcW w:type="dxa" w:w="1559"/>
+            <w:vMerge w:val="continue"/>
+          </w:tcPr>
+          <w:p/>
+        </w:tc>
+      </w:tr>
     </w:tbl>
-    <w:p>
-      <w:pPr>
-        <w:jc w:val="right"/>
-      </w:pPr>
-      <w:r>
-        <w:rPr>
-          <w:b/>
-        </w:rPr>
-        <w:t>Tổng cộng: {tong_tien}</w:t>
-      </w:r>
-    </w:p>
-    <w:p>
-      <w:pPr>
-        <w:jc w:val="right"/>
-      </w:pPr>
-      <w:r>
-        <w:t>Làm tròn: {lam_tron}</w:t>
-      </w:r>
-    </w:p>
-    <w:p>
-      <w:pPr>
-        <w:jc w:val="right"/>
-      </w:pPr>
-      <w:r>
-        <w:t>Tạm ứng: {tam_ung}</w:t>
-      </w:r>
-    </w:p>
-    <w:p>
-      <w:pPr>
-        <w:jc w:val="right"/>
-      </w:pPr>
-      <w:r>
-        <w:rPr>
-          <w:b/>
-        </w:rPr>
-        <w:t>Cần thanh toán: {can_thanh_toan}</w:t>
-      </w:r>
-    </w:p>
     <w:sectPr>
-      <w:pgSz w:w="12240" w:h="15840"/>
-      <w:pgMar w:top="1440" w:right="1800" w:bottom="1440" w:left="1800" w:header="720" w:footer="720" w:gutter="0"/>
+      <w:pgSz w:w="16838" w:h="11906" w:orient="landscape"/>
+      <w:pgMar w:top="283" w:right="340" w:bottom="283" w:left="340" w:header="720" w:footer="720" w:gutter="0"/>
       <w:cols w:space="720"/>
       <w:docGrid w:linePitch="360"/>
     </w:sectPr>
@@ -744,6 +1551,11 @@
     <w:name w:val="Normal"/>
     <w:qFormat/>
     <w:rsid w:val="00FC693F"/>
+    <w:rPr>
+      <w:rFonts w:ascii="Times New Roman" w:hAnsi="Times New Roman" w:eastAsia="Times New Roman"/>
+      <w:b/>
+      <w:sz w:val="18"/>
+    </w:rPr>
   </w:style>
   <w:style w:type="paragraph" w:styleId="Header">
     <w:name w:val="header"/>
@@ -759,6 +1571,9 @@
       </w:tabs>
       <w:spacing w:after="0" w:line="240" w:lineRule="auto"/>
     </w:pPr>
+    <w:rPr>
+      <w:rFonts w:ascii="Times New Roman" w:hAnsi="Times New Roman" w:eastAsia="Times New Roman"/>
+    </w:rPr>
   </w:style>
   <w:style w:type="character" w:customStyle="1" w:styleId="HeaderChar">
     <w:name w:val="Header Char"/>
@@ -781,6 +1596,9 @@
       </w:tabs>
       <w:spacing w:after="0" w:line="240" w:lineRule="auto"/>
     </w:pPr>
+    <w:rPr>
+      <w:rFonts w:ascii="Times New Roman" w:hAnsi="Times New Roman" w:eastAsia="Times New Roman"/>
+    </w:rPr>
   </w:style>
   <w:style w:type="character" w:customStyle="1" w:styleId="FooterChar">
     <w:name w:val="Footer Char"/>

</xml_diff>